<commit_message>
Add CFD governing equations (6)-(8) as native Word equations to Chapter 4
</commit_message>
<xml_diff>
--- a/Chapter_4_Experimentation.docx
+++ b/Chapter_4_Experimentation.docx
@@ -1,6 +1,6 @@
 
 <file path=word/document.xml><?xml version="1.0" encoding="utf-8"?>
-<w:document xmlns:w="http://schemas.openxmlformats.org/wordprocessingml/2006/main" xmlns:r="http://schemas.openxmlformats.org/officeDocument/2006/relationships" xmlns:wp="http://schemas.openxmlformats.org/drawingml/2006/wordprocessingDrawing" xmlns:a="http://schemas.openxmlformats.org/drawingml/2006/main" xmlns:pic="http://schemas.openxmlformats.org/drawingml/2006/picture">
+<w:document xmlns:w="http://schemas.openxmlformats.org/wordprocessingml/2006/main" xmlns:r="http://schemas.openxmlformats.org/officeDocument/2006/relationships" xmlns:wp="http://schemas.openxmlformats.org/drawingml/2006/wordprocessingDrawing" xmlns:a="http://schemas.openxmlformats.org/drawingml/2006/main" xmlns:pic="http://schemas.openxmlformats.org/drawingml/2006/picture" xmlns:m="http://schemas.openxmlformats.org/officeDocument/2006/math">
   <w:body>
     <w:p>
       <w:pPr>
@@ -4705,6 +4705,839 @@
           <w:rFonts w:ascii="Times New Roman" w:hAnsi="Times New Roman"/>
         </w:rPr>
         <w:t xml:space="preserve">Figure 4.2: Twenty five multi-pass SAW beads deposited on API X70 pipeline steel plate</w:t>
+      </w:r>
+    </w:p>
+    <w:p>
+      <w:pPr>
+        <w:jc w:val="both"/>
+      </w:pPr>
+      <w:r>
+        <w:rPr>
+          <w:sz w:val="24"/>
+          <w:szCs w:val="24"/>
+          <w:rFonts w:ascii="Times New Roman" w:hAnsi="Times New Roman"/>
+        </w:rPr>
+        <w:t xml:space="preserve"/>
+      </w:r>
+    </w:p>
+    <w:p>
+      <w:pPr>
+        <w:pStyle w:val="Heading3"/>
+        <w:jc w:val="both"/>
+      </w:pPr>
+      <w:r>
+        <w:rPr>
+          <w:b/>
+          <w:sz w:val="26"/>
+          <w:szCs w:val="26"/>
+          <w:rFonts w:ascii="Times New Roman" w:hAnsi="Times New Roman"/>
+        </w:rPr>
+        <w:t xml:space="preserve">4.2.1. Governing Equations of Weld Pool Fluid Flow and Heat Transfer</w:t>
+      </w:r>
+    </w:p>
+    <w:p>
+      <w:pPr>
+        <w:jc w:val="both"/>
+      </w:pPr>
+      <w:r>
+        <w:rPr>
+          <w:sz w:val="24"/>
+          <w:szCs w:val="24"/>
+          <w:rFonts w:ascii="Times New Roman" w:hAnsi="Times New Roman"/>
+        </w:rPr>
+        <w:t xml:space="preserve">The transport of momentum and thermal energy within the molten weld pool during submerged arc welding is described by the Reynolds-averaged conservation equations for an incompressible, turbulent flow. The continuity equation (6) enforces conservation of mass, the momentum equation (7) balances the inertial, pressure and viscous stresses including the turbulent eddy viscosity, and the energy equation (8) governs the convective and conductive transport of heat within the weld pool:</w:t>
+      </w:r>
+    </w:p>
+    <w:p>
+      <w:pPr>
+        <w:jc w:val="both"/>
+      </w:pPr>
+      <w:r>
+        <w:rPr>
+          <w:sz w:val="24"/>
+          <w:szCs w:val="24"/>
+          <w:rFonts w:ascii="Times New Roman" w:hAnsi="Times New Roman"/>
+        </w:rPr>
+        <w:t xml:space="preserve"/>
+      </w:r>
+    </w:p>
+    <w:tbl>
+      <w:tblPr>
+        <w:tblW w:w="5000" w:type="pct"/>
+        <w:tblBorders>
+          <w:top w:val="none"/>
+          <w:bottom w:val="none"/>
+          <w:left w:val="none"/>
+          <w:right w:val="none"/>
+          <w:insideH w:val="none"/>
+          <w:insideV w:val="none"/>
+        </w:tblBorders>
+      </w:tblPr>
+      <w:tr>
+        <w:tc>
+          <w:tcPr>
+            <w:tcW w:w="4500" w:type="pct"/>
+            <w:vAlign w:val="center"/>
+          </w:tcPr>
+          <w:p>
+            <w:pPr>
+              <w:jc w:val="center"/>
+            </w:pPr>
+            <m:oMathPara>
+              <m:oMath>
+                <m:f>
+                  <m:fPr>
+                    <m:type m:val="bar"/>
+                  </m:fPr>
+                  <m:num>
+                    <m:r>
+                      <m:rPr>
+                        <m:sty m:val="p"/>
+                      </m:rPr>
+                      <m:t xml:space="preserve">∂</m:t>
+                    </m:r>
+                    <m:d>
+                      <m:dPr>
+                        <m:begChr m:val="("/>
+                        <m:endChr m:val=")"/>
+                      </m:dPr>
+                      <m:e>
+                        <m:r>
+                          <m:t xml:space="preserve">ρ</m:t>
+                        </m:r>
+                        <m:sSub>
+                          <m:e>
+                            <m:r>
+                              <m:t xml:space="preserve">u</m:t>
+                            </m:r>
+                          </m:e>
+                          <m:sub>
+                            <m:r>
+                              <m:t xml:space="preserve">i</m:t>
+                            </m:r>
+                          </m:sub>
+                        </m:sSub>
+                      </m:e>
+                    </m:d>
+                  </m:num>
+                  <m:den>
+                    <m:r>
+                      <m:rPr>
+                        <m:sty m:val="p"/>
+                      </m:rPr>
+                      <m:t xml:space="preserve">∂</m:t>
+                    </m:r>
+                    <m:sSub>
+                      <m:e>
+                        <m:r>
+                          <m:t xml:space="preserve">x</m:t>
+                        </m:r>
+                      </m:e>
+                      <m:sub>
+                        <m:r>
+                          <m:t xml:space="preserve">i</m:t>
+                        </m:r>
+                      </m:sub>
+                    </m:sSub>
+                  </m:den>
+                </m:f>
+                <m:r>
+                  <m:rPr>
+                    <m:sty m:val="p"/>
+                  </m:rPr>
+                  <m:t xml:space="preserve">=</m:t>
+                </m:r>
+                <m:r>
+                  <m:t xml:space="preserve">0</m:t>
+                </m:r>
+              </m:oMath>
+            </m:oMathPara>
+          </w:p>
+        </w:tc>
+        <w:tc>
+          <w:tcPr>
+            <w:tcW w:w="500" w:type="pct"/>
+            <w:vAlign w:val="center"/>
+          </w:tcPr>
+          <w:p>
+            <w:pPr>
+              <w:jc w:val="right"/>
+            </w:pPr>
+            <w:r>
+              <w:rPr>
+                <w:sz w:val="24"/>
+                <w:szCs w:val="24"/>
+                <w:rFonts w:ascii="Times New Roman" w:hAnsi="Times New Roman"/>
+              </w:rPr>
+              <w:t xml:space="preserve">(6)</w:t>
+            </w:r>
+          </w:p>
+        </w:tc>
+      </w:tr>
+    </w:tbl>
+    <w:p>
+      <w:pPr>
+        <w:jc w:val="both"/>
+      </w:pPr>
+      <w:r>
+        <w:rPr>
+          <w:sz w:val="24"/>
+          <w:szCs w:val="24"/>
+          <w:rFonts w:ascii="Times New Roman" w:hAnsi="Times New Roman"/>
+        </w:rPr>
+        <w:t xml:space="preserve"/>
+      </w:r>
+    </w:p>
+    <w:tbl>
+      <w:tblPr>
+        <w:tblW w:w="5000" w:type="pct"/>
+        <w:tblBorders>
+          <w:top w:val="none"/>
+          <w:bottom w:val="none"/>
+          <w:left w:val="none"/>
+          <w:right w:val="none"/>
+          <w:insideH w:val="none"/>
+          <w:insideV w:val="none"/>
+        </w:tblBorders>
+      </w:tblPr>
+      <w:tr>
+        <w:tc>
+          <w:tcPr>
+            <w:tcW w:w="4500" w:type="pct"/>
+            <w:vAlign w:val="center"/>
+          </w:tcPr>
+          <w:p>
+            <w:pPr>
+              <w:jc w:val="center"/>
+            </w:pPr>
+            <m:oMathPara>
+              <m:oMath>
+                <m:f>
+                  <m:fPr>
+                    <m:type m:val="bar"/>
+                  </m:fPr>
+                  <m:num>
+                    <m:r>
+                      <m:rPr>
+                        <m:sty m:val="p"/>
+                      </m:rPr>
+                      <m:t xml:space="preserve">∂</m:t>
+                    </m:r>
+                    <m:d>
+                      <m:dPr>
+                        <m:begChr m:val="("/>
+                        <m:endChr m:val=")"/>
+                      </m:dPr>
+                      <m:e>
+                        <m:r>
+                          <m:t xml:space="preserve">ρ</m:t>
+                        </m:r>
+                        <m:sSub>
+                          <m:e>
+                            <m:r>
+                              <m:t xml:space="preserve">u</m:t>
+                            </m:r>
+                          </m:e>
+                          <m:sub>
+                            <m:r>
+                              <m:t xml:space="preserve">i</m:t>
+                            </m:r>
+                          </m:sub>
+                        </m:sSub>
+                        <m:sSub>
+                          <m:e>
+                            <m:r>
+                              <m:t xml:space="preserve">u</m:t>
+                            </m:r>
+                          </m:e>
+                          <m:sub>
+                            <m:r>
+                              <m:t xml:space="preserve">j</m:t>
+                            </m:r>
+                          </m:sub>
+                        </m:sSub>
+                      </m:e>
+                    </m:d>
+                  </m:num>
+                  <m:den>
+                    <m:r>
+                      <m:rPr>
+                        <m:sty m:val="p"/>
+                      </m:rPr>
+                      <m:t xml:space="preserve">∂</m:t>
+                    </m:r>
+                    <m:sSub>
+                      <m:e>
+                        <m:r>
+                          <m:t xml:space="preserve">x</m:t>
+                        </m:r>
+                      </m:e>
+                      <m:sub>
+                        <m:r>
+                          <m:t xml:space="preserve">j</m:t>
+                        </m:r>
+                      </m:sub>
+                    </m:sSub>
+                  </m:den>
+                </m:f>
+                <m:r>
+                  <m:rPr>
+                    <m:sty m:val="p"/>
+                  </m:rPr>
+                  <m:t xml:space="preserve">=</m:t>
+                </m:r>
+                <m:r>
+                  <m:rPr>
+                    <m:sty m:val="p"/>
+                  </m:rPr>
+                  <m:t xml:space="preserve">−</m:t>
+                </m:r>
+                <m:f>
+                  <m:fPr>
+                    <m:type m:val="bar"/>
+                  </m:fPr>
+                  <m:num>
+                    <m:r>
+                      <m:rPr>
+                        <m:sty m:val="p"/>
+                      </m:rPr>
+                      <m:t xml:space="preserve">∂</m:t>
+                    </m:r>
+                    <m:r>
+                      <m:t xml:space="preserve">p</m:t>
+                    </m:r>
+                  </m:num>
+                  <m:den>
+                    <m:r>
+                      <m:rPr>
+                        <m:sty m:val="p"/>
+                      </m:rPr>
+                      <m:t xml:space="preserve">∂</m:t>
+                    </m:r>
+                    <m:sSub>
+                      <m:e>
+                        <m:r>
+                          <m:t xml:space="preserve">x</m:t>
+                        </m:r>
+                      </m:e>
+                      <m:sub>
+                        <m:r>
+                          <m:t xml:space="preserve">i</m:t>
+                        </m:r>
+                      </m:sub>
+                    </m:sSub>
+                  </m:den>
+                </m:f>
+                <m:r>
+                  <m:rPr>
+                    <m:sty m:val="p"/>
+                  </m:rPr>
+                  <m:t xml:space="preserve">+</m:t>
+                </m:r>
+                <m:f>
+                  <m:fPr>
+                    <m:type m:val="bar"/>
+                  </m:fPr>
+                  <m:num>
+                    <m:r>
+                      <m:rPr>
+                        <m:sty m:val="p"/>
+                      </m:rPr>
+                      <m:t xml:space="preserve">∂</m:t>
+                    </m:r>
+                  </m:num>
+                  <m:den>
+                    <m:r>
+                      <m:rPr>
+                        <m:sty m:val="p"/>
+                      </m:rPr>
+                      <m:t xml:space="preserve">∂</m:t>
+                    </m:r>
+                    <m:sSub>
+                      <m:e>
+                        <m:r>
+                          <m:t xml:space="preserve">x</m:t>
+                        </m:r>
+                      </m:e>
+                      <m:sub>
+                        <m:r>
+                          <m:t xml:space="preserve">j</m:t>
+                        </m:r>
+                      </m:sub>
+                    </m:sSub>
+                  </m:den>
+                </m:f>
+                <m:d>
+                  <m:dPr>
+                    <m:begChr m:val="["/>
+                    <m:endChr m:val="]"/>
+                  </m:dPr>
+                  <m:e>
+                    <m:d>
+                      <m:dPr>
+                        <m:begChr m:val="("/>
+                        <m:endChr m:val=")"/>
+                      </m:dPr>
+                      <m:e>
+                        <m:r>
+                          <m:t xml:space="preserve">μ</m:t>
+                        </m:r>
+                        <m:r>
+                          <m:rPr>
+                            <m:sty m:val="p"/>
+                          </m:rPr>
+                          <m:t xml:space="preserve">+</m:t>
+                        </m:r>
+                        <m:sSub>
+                          <m:e>
+                            <m:r>
+                              <m:t xml:space="preserve">μ</m:t>
+                            </m:r>
+                          </m:e>
+                          <m:sub>
+                            <m:r>
+                              <m:t xml:space="preserve">t</m:t>
+                            </m:r>
+                          </m:sub>
+                        </m:sSub>
+                      </m:e>
+                    </m:d>
+                    <m:d>
+                      <m:dPr>
+                        <m:begChr m:val="("/>
+                        <m:endChr m:val=")"/>
+                      </m:dPr>
+                      <m:e>
+                        <m:f>
+                          <m:fPr>
+                            <m:type m:val="bar"/>
+                          </m:fPr>
+                          <m:num>
+                            <m:r>
+                              <m:rPr>
+                                <m:sty m:val="p"/>
+                              </m:rPr>
+                              <m:t xml:space="preserve">∂</m:t>
+                            </m:r>
+                            <m:sSub>
+                              <m:e>
+                                <m:r>
+                                  <m:t xml:space="preserve">u</m:t>
+                                </m:r>
+                              </m:e>
+                              <m:sub>
+                                <m:r>
+                                  <m:t xml:space="preserve">i</m:t>
+                                </m:r>
+                              </m:sub>
+                            </m:sSub>
+                          </m:num>
+                          <m:den>
+                            <m:r>
+                              <m:rPr>
+                                <m:sty m:val="p"/>
+                              </m:rPr>
+                              <m:t xml:space="preserve">∂</m:t>
+                            </m:r>
+                            <m:sSub>
+                              <m:e>
+                                <m:r>
+                                  <m:t xml:space="preserve">x</m:t>
+                                </m:r>
+                              </m:e>
+                              <m:sub>
+                                <m:r>
+                                  <m:t xml:space="preserve">j</m:t>
+                                </m:r>
+                              </m:sub>
+                            </m:sSub>
+                          </m:den>
+                        </m:f>
+                        <m:r>
+                          <m:rPr>
+                            <m:sty m:val="p"/>
+                          </m:rPr>
+                          <m:t xml:space="preserve">+</m:t>
+                        </m:r>
+                        <m:f>
+                          <m:fPr>
+                            <m:type m:val="bar"/>
+                          </m:fPr>
+                          <m:num>
+                            <m:r>
+                              <m:rPr>
+                                <m:sty m:val="p"/>
+                              </m:rPr>
+                              <m:t xml:space="preserve">∂</m:t>
+                            </m:r>
+                            <m:sSub>
+                              <m:e>
+                                <m:r>
+                                  <m:t xml:space="preserve">u</m:t>
+                                </m:r>
+                              </m:e>
+                              <m:sub>
+                                <m:r>
+                                  <m:t xml:space="preserve">j</m:t>
+                                </m:r>
+                              </m:sub>
+                            </m:sSub>
+                          </m:num>
+                          <m:den>
+                            <m:r>
+                              <m:rPr>
+                                <m:sty m:val="p"/>
+                              </m:rPr>
+                              <m:t xml:space="preserve">∂</m:t>
+                            </m:r>
+                            <m:sSub>
+                              <m:e>
+                                <m:r>
+                                  <m:t xml:space="preserve">x</m:t>
+                                </m:r>
+                              </m:e>
+                              <m:sub>
+                                <m:r>
+                                  <m:t xml:space="preserve">i</m:t>
+                                </m:r>
+                              </m:sub>
+                            </m:sSub>
+                          </m:den>
+                        </m:f>
+                      </m:e>
+                    </m:d>
+                  </m:e>
+                </m:d>
+              </m:oMath>
+            </m:oMathPara>
+          </w:p>
+        </w:tc>
+        <w:tc>
+          <w:tcPr>
+            <w:tcW w:w="500" w:type="pct"/>
+            <w:vAlign w:val="center"/>
+          </w:tcPr>
+          <w:p>
+            <w:pPr>
+              <w:jc w:val="right"/>
+            </w:pPr>
+            <w:r>
+              <w:rPr>
+                <w:sz w:val="24"/>
+                <w:szCs w:val="24"/>
+                <w:rFonts w:ascii="Times New Roman" w:hAnsi="Times New Roman"/>
+              </w:rPr>
+              <w:t xml:space="preserve">(7)</w:t>
+            </w:r>
+          </w:p>
+        </w:tc>
+      </w:tr>
+    </w:tbl>
+    <w:p>
+      <w:pPr>
+        <w:jc w:val="both"/>
+      </w:pPr>
+      <w:r>
+        <w:rPr>
+          <w:sz w:val="24"/>
+          <w:szCs w:val="24"/>
+          <w:rFonts w:ascii="Times New Roman" w:hAnsi="Times New Roman"/>
+        </w:rPr>
+        <w:t xml:space="preserve"/>
+      </w:r>
+    </w:p>
+    <w:tbl>
+      <w:tblPr>
+        <w:tblW w:w="5000" w:type="pct"/>
+        <w:tblBorders>
+          <w:top w:val="none"/>
+          <w:bottom w:val="none"/>
+          <w:left w:val="none"/>
+          <w:right w:val="none"/>
+          <w:insideH w:val="none"/>
+          <w:insideV w:val="none"/>
+        </w:tblBorders>
+      </w:tblPr>
+      <w:tr>
+        <w:tc>
+          <w:tcPr>
+            <w:tcW w:w="4500" w:type="pct"/>
+            <w:vAlign w:val="center"/>
+          </w:tcPr>
+          <w:p>
+            <w:pPr>
+              <w:jc w:val="center"/>
+            </w:pPr>
+            <m:oMathPara>
+              <m:oMath>
+                <m:f>
+                  <m:fPr>
+                    <m:type m:val="bar"/>
+                  </m:fPr>
+                  <m:num>
+                    <m:r>
+                      <m:rPr>
+                        <m:sty m:val="p"/>
+                      </m:rPr>
+                      <m:t xml:space="preserve">∂</m:t>
+                    </m:r>
+                    <m:d>
+                      <m:dPr>
+                        <m:begChr m:val="("/>
+                        <m:endChr m:val=")"/>
+                      </m:dPr>
+                      <m:e>
+                        <m:r>
+                          <m:t xml:space="preserve">ρ</m:t>
+                        </m:r>
+                        <m:sSub>
+                          <m:e>
+                            <m:r>
+                              <m:t xml:space="preserve">C</m:t>
+                            </m:r>
+                          </m:e>
+                          <m:sub>
+                            <m:r>
+                              <m:t xml:space="preserve">p</m:t>
+                            </m:r>
+                          </m:sub>
+                        </m:sSub>
+                        <m:sSub>
+                          <m:e>
+                            <m:r>
+                              <m:t xml:space="preserve">u</m:t>
+                            </m:r>
+                          </m:e>
+                          <m:sub>
+                            <m:r>
+                              <m:t xml:space="preserve">j</m:t>
+                            </m:r>
+                          </m:sub>
+                        </m:sSub>
+                        <m:r>
+                          <m:t xml:space="preserve">T</m:t>
+                        </m:r>
+                      </m:e>
+                    </m:d>
+                  </m:num>
+                  <m:den>
+                    <m:r>
+                      <m:rPr>
+                        <m:sty m:val="p"/>
+                      </m:rPr>
+                      <m:t xml:space="preserve">∂</m:t>
+                    </m:r>
+                    <m:sSub>
+                      <m:e>
+                        <m:r>
+                          <m:t xml:space="preserve">x</m:t>
+                        </m:r>
+                      </m:e>
+                      <m:sub>
+                        <m:r>
+                          <m:t xml:space="preserve">j</m:t>
+                        </m:r>
+                      </m:sub>
+                    </m:sSub>
+                  </m:den>
+                </m:f>
+                <m:r>
+                  <m:rPr>
+                    <m:sty m:val="p"/>
+                  </m:rPr>
+                  <m:t xml:space="preserve">=</m:t>
+                </m:r>
+                <m:f>
+                  <m:fPr>
+                    <m:type m:val="bar"/>
+                  </m:fPr>
+                  <m:num>
+                    <m:r>
+                      <m:rPr>
+                        <m:sty m:val="p"/>
+                      </m:rPr>
+                      <m:t xml:space="preserve">∂</m:t>
+                    </m:r>
+                  </m:num>
+                  <m:den>
+                    <m:r>
+                      <m:rPr>
+                        <m:sty m:val="p"/>
+                      </m:rPr>
+                      <m:t xml:space="preserve">∂</m:t>
+                    </m:r>
+                    <m:sSub>
+                      <m:e>
+                        <m:r>
+                          <m:t xml:space="preserve">x</m:t>
+                        </m:r>
+                      </m:e>
+                      <m:sub>
+                        <m:r>
+                          <m:t xml:space="preserve">j</m:t>
+                        </m:r>
+                      </m:sub>
+                    </m:sSub>
+                  </m:den>
+                </m:f>
+                <m:d>
+                  <m:dPr>
+                    <m:begChr m:val="["/>
+                    <m:endChr m:val="]"/>
+                  </m:dPr>
+                  <m:e>
+                    <m:d>
+                      <m:dPr>
+                        <m:begChr m:val="("/>
+                        <m:endChr m:val=")"/>
+                      </m:dPr>
+                      <m:e>
+                        <m:r>
+                          <m:t xml:space="preserve">k</m:t>
+                        </m:r>
+                        <m:r>
+                          <m:rPr>
+                            <m:sty m:val="p"/>
+                          </m:rPr>
+                          <m:t xml:space="preserve">+</m:t>
+                        </m:r>
+                        <m:f>
+                          <m:fPr>
+                            <m:type m:val="bar"/>
+                          </m:fPr>
+                          <m:num>
+                            <m:sSub>
+                              <m:e>
+                                <m:r>
+                                  <m:t xml:space="preserve">C</m:t>
+                                </m:r>
+                              </m:e>
+                              <m:sub>
+                                <m:r>
+                                  <m:t xml:space="preserve">p</m:t>
+                                </m:r>
+                              </m:sub>
+                            </m:sSub>
+                            <m:sSub>
+                              <m:e>
+                                <m:r>
+                                  <m:t xml:space="preserve">μ</m:t>
+                                </m:r>
+                              </m:e>
+                              <m:sub>
+                                <m:r>
+                                  <m:t xml:space="preserve">t</m:t>
+                                </m:r>
+                              </m:sub>
+                            </m:sSub>
+                          </m:num>
+                          <m:den>
+                            <m:sSub>
+                              <m:e>
+                                <m:r>
+                                  <m:rPr>
+                                    <m:sty m:val="p"/>
+                                  </m:rPr>
+                                  <m:t xml:space="preserve">Pr</m:t>
+                                </m:r>
+                              </m:e>
+                              <m:sub>
+                                <m:r>
+                                  <m:t xml:space="preserve">t</m:t>
+                                </m:r>
+                              </m:sub>
+                            </m:sSub>
+                          </m:den>
+                        </m:f>
+                      </m:e>
+                    </m:d>
+                    <m:f>
+                      <m:fPr>
+                        <m:type m:val="bar"/>
+                      </m:fPr>
+                      <m:num>
+                        <m:r>
+                          <m:rPr>
+                            <m:sty m:val="p"/>
+                          </m:rPr>
+                          <m:t xml:space="preserve">∂</m:t>
+                        </m:r>
+                        <m:r>
+                          <m:t xml:space="preserve">T</m:t>
+                        </m:r>
+                      </m:num>
+                      <m:den>
+                        <m:r>
+                          <m:rPr>
+                            <m:sty m:val="p"/>
+                          </m:rPr>
+                          <m:t xml:space="preserve">∂</m:t>
+                        </m:r>
+                        <m:sSub>
+                          <m:e>
+                            <m:r>
+                              <m:t xml:space="preserve">x</m:t>
+                            </m:r>
+                          </m:e>
+                          <m:sub>
+                            <m:r>
+                              <m:t xml:space="preserve">j</m:t>
+                            </m:r>
+                          </m:sub>
+                        </m:sSub>
+                      </m:den>
+                    </m:f>
+                  </m:e>
+                </m:d>
+              </m:oMath>
+            </m:oMathPara>
+          </w:p>
+        </w:tc>
+        <w:tc>
+          <w:tcPr>
+            <w:tcW w:w="500" w:type="pct"/>
+            <w:vAlign w:val="center"/>
+          </w:tcPr>
+          <w:p>
+            <w:pPr>
+              <w:jc w:val="right"/>
+            </w:pPr>
+            <w:r>
+              <w:rPr>
+                <w:sz w:val="24"/>
+                <w:szCs w:val="24"/>
+                <w:rFonts w:ascii="Times New Roman" w:hAnsi="Times New Roman"/>
+              </w:rPr>
+              <w:t xml:space="preserve">(8)</w:t>
+            </w:r>
+          </w:p>
+        </w:tc>
+      </w:tr>
+    </w:tbl>
+    <w:p>
+      <w:pPr>
+        <w:jc w:val="both"/>
+      </w:pPr>
+      <w:r>
+        <w:rPr>
+          <w:sz w:val="24"/>
+          <w:szCs w:val="24"/>
+          <w:rFonts w:ascii="Times New Roman" w:hAnsi="Times New Roman"/>
+        </w:rPr>
+        <w:t xml:space="preserve"/>
+      </w:r>
+    </w:p>
+    <w:p>
+      <w:pPr>
+        <w:jc w:val="both"/>
+      </w:pPr>
+      <w:r>
+        <w:rPr>
+          <w:sz w:val="24"/>
+          <w:szCs w:val="24"/>
+          <w:rFonts w:ascii="Times New Roman" w:hAnsi="Times New Roman"/>
+        </w:rPr>
+        <w:t xml:space="preserve">Here ρ is the fluid density, u_i and u_j are the velocity components, x_i and x_j are the spatial coordinates, p is the pressure, μ is the dynamic viscosity, μ_t is the turbulent (eddy) viscosity, C_p is the specific heat capacity at constant pressure, T is the temperature, k is the thermal conductivity, and Pr_t is the turbulent Prandtl number.</w:t>
       </w:r>
     </w:p>
     <w:p>

</xml_diff>